<commit_message>
Guía de Alianza: ajustes de la verificación final (Word y Excel)
- Mapa del PPT: diap. 4 incluye el «61% inferior»; el peso de la MP pasa a las diap. 6, 11 y 13 (no a la 10).
- Roles en dividendos: la Gerencia presenta las alternativas y decide la Dirección.
- Excepción del rótulo Ej_Costos!P1 (paso D2), control de A1, notas de los indicadores 10, 22 y 33, total del anexo A y redacción de la sección 2.

Co-Authored-By: Claude Opus 5.5 <noreply@anthropic.com>
Claude-Session: https://claude.ai/code/session_01Q4oZnCzWT5uwD7Y9gLbehx
</commit_message>
<xml_diff>
--- a/alianza/Guia_Paso_a_Paso_Actualizacion_Plan_ALIANZA_DEL_ACERO.docx
+++ b/alianza/Guia_Paso_a_Paso_Actualizacion_Plan_ALIANZA_DEL_ACERO.docx
@@ -641,7 +641,7 @@
         <w:t xml:space="preserve">Sin dividendos, los faltantes de caja son de calce:</w:t>
       </w:r>
       <w:r>
-        <w:t xml:space="preserve"> desde ago-2026, 6 meses entre abr-2030 y ago-2032; el peor es ago-2032, con −736.298. Se cubren con préstamos CP (paso E3). El resto del faltante viene de los dividendos de 2031-2035 (≈ USD 10,0M), que reparten el 100% de las utilidades de 2027-2031 más 800.000 de la de 2032; sin ellos, el saldo a dic-2035 sería de 7.765.787. Esa utilidad no está toda en caja, porque el flujo también paga el capital del préstamo LP (5.568.594 en 2026-2031) y financia el aumento del capital de trabajo. Diferir o reducir dividendos no se decide al actualizar el modelo: la Gerencia presenta las alternativas y decide la Dirección (paso E5).</w:t>
+        <w:t xml:space="preserve"> contando desde ago-2026 (rango del control 13), el saldo es negativo en 6 meses entre abr-2030 y ago-2032; el peor es ago-2032, con −736.298. Se cubren con préstamos CP (paso E3). El resto del faltante viene de los dividendos de 2031-2035 (≈ USD 10,0M), que reparten el 100% de las utilidades de 2027-2031 más 800.000 de la de 2032; sin ellos, el saldo a dic-2035 sería de 7.765.787. Esa utilidad no está toda en caja, porque el flujo también paga el capital del préstamo LP (5.568.594 en 2026-2031) y financia el aumento del capital de trabajo. Diferir o reducir dividendos no se decide al actualizar el modelo: la Gerencia presenta las alternativas y decide la Dirección (paso E5).</w:t>
       </w:r>
     </w:p>
     <w:p>
@@ -661,7 +661,7 @@
         <w:t xml:space="preserve">El plan original casi no está en el Excel.</w:t>
       </w:r>
       <w:r>
-        <w:t xml:space="preserve"> En el libro solo están los años 1 y 2 del plan (columnas P y AE de las hojas Ej_). El VAN y la TIR del plan, el payback de 3 años y los rótulos acumulados (sección 4 de «CONTROLES Y PPT») y las series plan de los gráficos, los 10 años (sección 3, filas 82, 85, 87 y 89), vienen del PPT de junio 2026. Solo los años 1 y 2 de producción e ingresos coinciden con el libro; los de costos y EBITDA no (EBITDA plan del año 1: 732.980 en el PPT y 841.163 en Ej_Resultados!P13). Conviene confirmarlos contra el plan de negocio original (PDF de enero 2026).</w:t>
+        <w:t xml:space="preserve"> En el libro solo están los años 1 y 2 del plan (columnas P y AE de las hojas Ej_). El VAN y la TIR del plan, el payback de 3 años y los rótulos acumulados (sección 4 de «CONTROLES Y PPT»), así como las series plan de los gráficos para los 10 años (sección 3, filas 82, 85, 87 y 89), vienen del PPT de junio 2026. Solo los años 1 y 2 de producción e ingresos coinciden con el libro; los de costos y EBITDA no (EBITDA plan del año 1: 732.980 en el PPT y 841.163 en Ej_Resultados!P13). Conviene confirmarlos contra el plan de negocio original (PDF de enero 2026).</w:t>
       </w:r>
     </w:p>
     <w:p>
@@ -775,7 +775,7 @@
         <w:spacing w:after="100" w:before="0" w:line="264"/>
       </w:pPr>
       <w:r>
-        <w:t xml:space="preserve">Escribir solo en las celdas indicadas. No escribir en columnas de total o promedio (O y AD de Ej_Producción, Ej_Ingresos, Ej_Costos, Ej_Resultados y Ej_Deuda; O, AB, AO, BB, BO, CB, CO, DB, DO, EB y EF de Ej_Flujo), salvo las celdas que un paso indica expresamente: Ej_Producción!O31:O32 y O46:O47 (B4), Ej_Costos!O9:O19 y AD9:AD19 (B5), Ej_Costos!O1 (D2) y Ej_Flujo!O37 y O40 (E2). Tampoco en el plan original (columnas P y AE de esas cinco hojas; columna E de Supuestos). En Ej_Flujo no hay columnas de plan: P, AD y AE son meses (ene-2027, feb-2028 y mar-2028) y se editan cuando un paso lo indica. El auxiliar Ej_Costos!O88:P114 (paso D5) no es plan ni total.</w:t>
+        <w:t xml:space="preserve">Escribir solo en las celdas indicadas. No escribir en columnas de total o promedio (O y AD de Ej_Producción, Ej_Ingresos, Ej_Costos, Ej_Resultados y Ej_Deuda; O, AB, AO, BB, BO, CB, CO, DB, DO, EB y EF de Ej_Flujo), salvo las celdas que un paso indica expresamente: Ej_Producción!O31:O32 y O46:O47 (B4), Ej_Costos!O9:O19 y AD9:AD19 (B5), Ej_Costos!O1 (D2) y Ej_Flujo!O37 y O40 (E2). Tampoco en el plan original (columnas P y AE de esas cinco hojas, salvo el rótulo Ej_Costos!P1, que se actualiza en el paso D2; columna E de Supuestos). En Ej_Flujo no hay columnas de plan: P, AD y AE son meses (ene-2027, feb-2028 y mar-2028) y se editan cuando un paso lo indica. El auxiliar Ej_Costos!O88:P114 (paso D5) no es plan ni total.</w:t>
       </w:r>
     </w:p>
     <w:p>
@@ -802,6 +802,7 @@
     </w:p>
     <w:p>
       <w:pPr>
+        <w:keepNext/>
         <w:spacing w:after="100" w:before="0" w:line="264"/>
       </w:pPr>
       <w:r>
@@ -2421,7 +2422,7 @@
                 <w:sz w:val="18"/>
                 <w:szCs w:val="18"/>
               </w:rPr>
-              <w:t xml:space="preserve">Los nombres del libro y del PPT indican versión y fecha.</w:t>
+              <w:t xml:space="preserve">El nombre del libro indica versión y fecha (y, antes de empezar la fase G, también el del PPT).</w:t>
             </w:r>
           </w:p>
         </w:tc>
@@ -19651,7 +19652,7 @@
                 <w:sz w:val="18"/>
                 <w:szCs w:val="18"/>
               </w:rPr>
-              <w:t xml:space="preserve">Resumen, tabla comparativa, evaluación y conclusiones: VAN, TIR, WACC, inversión, acumulados, variaciones contra el plan, desvío de MP, capital de trabajo y préstamos CP</w:t>
+              <w:t xml:space="preserve">Resumen, tabla comparativa, evaluación y conclusiones: VAN, TIR, WACC, inversión, acumulados, variaciones contra el plan, peso y desvío de la MP, capital de trabajo y préstamos CP</w:t>
             </w:r>
           </w:p>
         </w:tc>
@@ -19683,7 +19684,7 @@
                 <w:sz w:val="18"/>
                 <w:szCs w:val="18"/>
               </w:rPr>
-              <w:t xml:space="preserve">Sección 2, indicadores 1 a 19, 23, 24 y 31 a 34 (filas 38 a 56, 60, 61 y 68 a 71)</w:t>
+              <w:t xml:space="preserve">Sección 2, indicadores 1 a 19, 22 a 24 y 31 a 34 (filas 38 a 56, 59 a 61 y 68 a 71)</w:t>
             </w:r>
           </w:p>
         </w:tc>
@@ -19919,7 +19920,7 @@
                 <w:sz w:val="18"/>
                 <w:szCs w:val="18"/>
               </w:rPr>
-              <w:t xml:space="preserve">Texto: producción del año 1, % del plan, acumulado y variaciones; años 2 y 10 frente al plan</w:t>
+              <w:t xml:space="preserve">Texto: producción del año 1, % del plan (y su complemento, «61% inferior»), acumulado y variaciones; años 2 y 10 frente al plan</w:t>
             </w:r>
           </w:p>
         </w:tc>
@@ -21393,7 +21394,7 @@
                 <w:sz w:val="18"/>
                 <w:szCs w:val="18"/>
               </w:rPr>
-              <w:t xml:space="preserve">Texto: ventas y punto de equilibrio del año 1, margen de seguridad, peso de la MP en el costo</w:t>
+              <w:t xml:space="preserve">Texto: ventas y punto de equilibrio del año 1 y margen de seguridad</w:t>
             </w:r>
           </w:p>
         </w:tc>
@@ -21425,7 +21426,7 @@
                 <w:sz w:val="18"/>
                 <w:szCs w:val="18"/>
               </w:rPr>
-              <w:t xml:space="preserve">Sección 3, filas 83 y 93, columna E; sección 2, indicadores 22, 35 y 36 (filas 59, 72 y 73)</w:t>
+              <w:t xml:space="preserve">Sección 3, filas 83 y 93, columna E; sección 2, indicadores 35 y 36 (filas 72 y 73)</w:t>
             </w:r>
           </w:p>
         </w:tc>
@@ -21959,7 +21960,7 @@
         <w:t xml:space="preserve">Política de dividendos frente a la caja corregida</w:t>
       </w:r>
       <w:r>
-        <w:t xml:space="preserve"> (paso E5). Los dividendos de 2031-2035 (≈ USD 10M) reparten el 100% de las utilidades de 2027-2031 más 800.000 de la de 2032 (Resultados filas 18 y 25-31; los únicos montos tipeados son 500.000 y 800.000). Con la caja corregida en la fase B superan la caja disponible si los préstamos CP se devuelven a más tardar en dic-2035 (saldo a dic-2035 ≈ −2,22M). Las alternativas para presentar a la Gerencia son diferir o reducir dividendos, mantener deuda CP al cierre o refinanciar a largo plazo; la política no se cambia sin instrucción de la Dirección.</w:t>
+        <w:t xml:space="preserve"> (paso E5). Los dividendos de 2031-2035 (≈ USD 10M) reparten el 100% de las utilidades de 2027-2031 más 800.000 de la de 2032 (Resultados filas 18 y 25-31; los únicos montos tipeados son 500.000 y 800.000). Con la caja corregida en la fase B superan la caja disponible si los préstamos CP se devuelven a más tardar en dic-2035 (saldo a dic-2035 ≈ −2,22M). Las alternativas que la Gerencia presenta a la Dirección son diferir o reducir dividendos, mantener deuda CP al cierre o refinanciar a largo plazo; la política no se cambia sin instrucción de la Dirección.</w:t>
       </w:r>
     </w:p>
     <w:p>
@@ -22362,7 +22363,7 @@
                 <w:sz w:val="17"/>
                 <w:szCs w:val="17"/>
               </w:rPr>
-              <w:t xml:space="preserve">Versión base del PPT «Plan vs Actualizado 10 años» (junio 2026). Guía y controles agregados el 13/10/2026 sin modificar el modelo.</w:t>
+              <w:t xml:space="preserve">Versión base usada en el PPT «Plan vs Actualizado 10 años» de junio 2026. Guía y controles agregados el 13/10/2026 y actualizados el 16/10/2026, sin modificar el modelo.</w:t>
             </w:r>
           </w:p>
         </w:tc>
@@ -25018,7 +25019,7 @@
                 <w:sz w:val="18"/>
                 <w:szCs w:val="18"/>
               </w:rPr>
-              <w:t xml:space="preserve">−2.617.452</w:t>
+              <w:t xml:space="preserve">−2.617.452 (las filas suman −2.617.453 por redondeo)</w:t>
             </w:r>
           </w:p>
         </w:tc>

</xml_diff>